<commit_message>
Sandy & Junior: revisão da Parte 3
Co-Authored-By: Claude Opus 5.5 <noreply@anthropic.com>
Claude-Session: https://claude.ai/code/session_01MJjUEEZrxQDEUifKK2vj9g
</commit_message>
<xml_diff>
--- a/roteiros/sandy-junior/SJ_Parte3.docx
+++ b/roteiros/sandy-junior/SJ_Parte3.docx
@@ -71,7 +71,7 @@
         <w:rPr>
           <w:color w:val="000000"/>
         </w:rPr>
-        <w:t>Sandy estava com o pé machucado. Um tratamento malfeito tinha deixado o pé dela ferido e dolorido. Mesmo assim, ela subiu ao palco e dançou o show inteiro como se nada estivesse acontecendo.</w:t>
+        <w:t>Sandy estava com o pé machucado. Um tratamento malfeito tinha deixado o pé dela ferido e dolorido. Mesmo assim, ela subiu ao palco e fez o show.</w:t>
       </w:r>
     </w:p>
     <w:p>
@@ -87,7 +87,7 @@
         <w:rPr>
           <w:color w:val="000000"/>
         </w:rPr>
-        <w:t>O público cantou cada música.</w:t>
+        <w:t>O público cantou cada música. Os irmãos fizeram o estádio inteiro cantar até o tema do filme Titanic.</w:t>
       </w:r>
     </w:p>
     <w:p>
@@ -127,7 +127,7 @@
         <w:rPr>
           <w:color w:val="000000"/>
         </w:rPr>
-        <w:t>Ela queria ser atriz. Era um desejo antigo. A Globo fez uma coisa rara e criou uma novela pensada para ela.</w:t>
+        <w:t>Ela queria ser atriz. A Globo fez uma coisa rara e criou uma novela pensada para ela.</w:t>
       </w:r>
     </w:p>
     <w:p>
@@ -143,7 +143,7 @@
         <w:rPr>
           <w:color w:val="000000"/>
         </w:rPr>
-        <w:t>Nas gravações, ela ganhou uma amiga para a vida inteira, a atriz Fernanda Rodrigues. Por alguns meses, Sandy pôde ser outra pessoa diante das câmeras.</w:t>
+        <w:t>Nas gravações, ela ganhou uma amiga para a vida inteira, a atriz Fernanda Rodrigues. Por alguns meses, Sandy pôde ser outra pessoa diante das câmeras. Por causa das gravações, ela chegou a aparecer menos na série da dupla.</w:t>
       </w:r>
     </w:p>
     <w:p>
@@ -231,7 +231,7 @@
         <w:rPr>
           <w:color w:val="000000"/>
         </w:rPr>
-        <w:t>Mas a Globo nunca deixou aquilo ir ao ar. A cena foi engavetada para proteger Sandy e nunca chegou à televisão.</w:t>
+        <w:t>Mas a Globo vetou a exibição para proteger Sandy. A cena foi engavetada.</w:t>
       </w:r>
     </w:p>
     <w:p>
@@ -239,7 +239,7 @@
         <w:rPr>
           <w:color w:val="000000"/>
         </w:rPr>
-        <w:t>Anos depois, Cláudio Manoel, um dos integrantes do grupo, contou essa história num programa de entrevistas. A paródia continua guardada até hoje.</w:t>
+        <w:t>Anos depois, Cláudio Manoel, um dos integrantes do grupo, contou essa história num programa de entrevistas. Até hoje, a paródia nunca foi exibida.</w:t>
       </w:r>
     </w:p>
     <w:p>
@@ -359,7 +359,7 @@
         <w:rPr>
           <w:color w:val="000000"/>
         </w:rPr>
-        <w:t>As perguntas eram para Sandy. A novela era de Sandy. As catorze capas eram de Sandy.</w:t>
+        <w:t>As perguntas eram para Sandy. As catorze capas também.</w:t>
       </w:r>
     </w:p>
     <w:p>
@@ -423,7 +423,7 @@
         <w:rPr>
           <w:color w:val="000000"/>
         </w:rPr>
-        <w:t>Pegava as baquetas e tocava bateria com raiva. Pegava a guitarra e treinava por horas, com a mesma raiva.</w:t>
+        <w:t>Pegava as baquetas e tocava bateria com raiva. Pegava a guitarra com a mesma raiva.</w:t>
       </w:r>
     </w:p>
     <w:p>
@@ -439,7 +439,7 @@
         <w:rPr>
           <w:color w:val="000000"/>
         </w:rPr>
-        <w:t>Lembra da percussão no Rock in Rio? Aquele solo diante de duzentas e cinquenta mil pessoas era o resultado de anos de raiva acumulada.</w:t>
+        <w:t>Lembra da percussão no Rock in Rio? Aquele solo diante de duzentas e cinquenta mil pessoas também nasceu dessa raiva.</w:t>
       </w:r>
     </w:p>
     <w:p>
@@ -591,7 +591,7 @@
         <w:rPr>
           <w:color w:val="000000"/>
         </w:rPr>
-        <w:t>A plateia chorava. Eles também.</w:t>
+        <w:t>Foi uma noite de despedida, carregada de emoção.</w:t>
       </w:r>
     </w:p>
     <w:p>

</xml_diff>